<commit_message>
Release v2.1.1: Tauri GUI, packaging, flat/routed intake, VM-verified
Ship the first production-ready Windows zip with Tauri + FastAPI, flat and
routed intake, configurable filename conventions, per-screen specs, packaging
scripts, and WebView2-safe filename token reordering.

Co-authored-by: Cursor <cursoragent@cursor.com>
</commit_message>
<xml_diff>
--- a/templates/spec_template.docx
+++ b/templates/spec_template.docx
@@ -16,7 +16,27 @@
           <w:sz w:val="26"/>
           <w:szCs w:val="26"/>
         </w:rPr>
-        <w:t>Prestige AV - PIXERA CONTENT DELIVERY SPECIFICATION</w:t>
+        <w:t>[Company Name]</w:t>
+      </w:r>
+      <w:r>
+        <w:rPr>
+          <w:rFonts w:ascii="Calibri" w:eastAsia="Calibri" w:hAnsi="Calibri" w:cs="Calibri"/>
+          <w:b/>
+          <w:bCs/>
+          <w:sz w:val="26"/>
+          <w:szCs w:val="26"/>
+        </w:rPr>
+        <w:t xml:space="preserve"> </w:t>
+      </w:r>
+      <w:r>
+        <w:rPr>
+          <w:rFonts w:ascii="Calibri" w:eastAsia="Calibri" w:hAnsi="Calibri" w:cs="Calibri"/>
+          <w:b/>
+          <w:bCs/>
+          <w:sz w:val="26"/>
+          <w:szCs w:val="26"/>
+        </w:rPr>
+        <w:t>- CONTENT DELIVERY SPECIFICATION</w:t>
       </w:r>
     </w:p>
     <w:p>
@@ -43,9 +63,31 @@
           <w:sz w:val="18"/>
           <w:szCs w:val="18"/>
         </w:rPr>
-        <w:t xml:space="preserve">[Project </w:t>
+        <w:t>[</w:t>
+      </w:r>
+      <w:r>
+        <w:rPr>
+          <w:rFonts w:ascii="Calibri" w:eastAsia="Calibri" w:hAnsi="Calibri" w:cs="Calibri"/>
+          <w:b/>
+          <w:bCs/>
+          <w:color w:val="C00000"/>
+          <w:sz w:val="18"/>
+          <w:szCs w:val="18"/>
+        </w:rPr>
+        <w:t xml:space="preserve">Project </w:t>
       </w:r>
       <w:proofErr w:type="gramStart"/>
+      <w:r>
+        <w:rPr>
+          <w:rFonts w:ascii="Calibri" w:eastAsia="Calibri" w:hAnsi="Calibri" w:cs="Calibri"/>
+          <w:b/>
+          <w:bCs/>
+          <w:color w:val="C00000"/>
+          <w:sz w:val="18"/>
+          <w:szCs w:val="18"/>
+        </w:rPr>
+        <w:t>Name</w:t>
+      </w:r>
       <w:r>
         <w:rPr>
           <w:rFonts w:ascii="Calibri" w:eastAsia="Calibri" w:hAnsi="Calibri" w:cs="Calibri"/>
@@ -55,7 +97,7 @@
           <w:sz w:val="18"/>
           <w:szCs w:val="18"/>
         </w:rPr>
-        <w:t>Name]</w:t>
+        <w:t>]</w:t>
       </w:r>
       <w:r>
         <w:rPr>
@@ -1075,7 +1117,7 @@
           <w:sz w:val="18"/>
           <w:szCs w:val="18"/>
         </w:rPr>
-        <w:t>See attached screen diagram for physical placement and template files for each screen's exact pixel dimensions</w:t>
+        <w:t>[Optional Notes]</w:t>
       </w:r>
     </w:p>
     <w:p>
@@ -1338,71 +1380,27 @@
             </w:tcMar>
           </w:tcPr>
           <w:p>
-            <w:proofErr w:type="spellStart"/>
-            <w:r>
-              <w:rPr>
-                <w:rFonts w:ascii="Calibri" w:eastAsia="Calibri" w:hAnsi="Calibri" w:cs="Calibri"/>
-                <w:b/>
-                <w:bCs/>
-                <w:sz w:val="18"/>
-                <w:szCs w:val="18"/>
-              </w:rPr>
-              <w:t>ProRes</w:t>
-            </w:r>
-            <w:proofErr w:type="spellEnd"/>
-            <w:r>
-              <w:rPr>
-                <w:rFonts w:ascii="Calibri" w:eastAsia="Calibri" w:hAnsi="Calibri" w:cs="Calibri"/>
-                <w:b/>
-                <w:bCs/>
-                <w:sz w:val="18"/>
-                <w:szCs w:val="18"/>
-              </w:rPr>
-              <w:t xml:space="preserve"> 422 HQ (.mov) for standard content. </w:t>
-            </w:r>
-            <w:proofErr w:type="spellStart"/>
-            <w:r>
-              <w:rPr>
-                <w:rFonts w:ascii="Calibri" w:eastAsia="Calibri" w:hAnsi="Calibri" w:cs="Calibri"/>
-                <w:b/>
-                <w:bCs/>
-                <w:sz w:val="18"/>
-                <w:szCs w:val="18"/>
-              </w:rPr>
-              <w:t>ProRes</w:t>
-            </w:r>
-            <w:proofErr w:type="spellEnd"/>
-            <w:r>
-              <w:rPr>
-                <w:rFonts w:ascii="Calibri" w:eastAsia="Calibri" w:hAnsi="Calibri" w:cs="Calibri"/>
-                <w:b/>
-                <w:bCs/>
+            <w:r>
+              <w:rPr>
+                <w:rFonts w:ascii="Calibri" w:eastAsia="Calibri" w:hAnsi="Calibri" w:cs="Calibri"/>
+                <w:b/>
+                <w:bCs/>
+                <w:color w:val="C00000"/>
+                <w:sz w:val="18"/>
+                <w:szCs w:val="18"/>
+              </w:rPr>
+              <w:t>[Codec]</w:t>
+            </w:r>
+            <w:r>
+              <w:rPr>
+                <w:rFonts w:ascii="Calibri" w:eastAsia="Calibri" w:hAnsi="Calibri" w:cs="Calibri"/>
+                <w:b/>
+                <w:bCs/>
+                <w:color w:val="C00000"/>
                 <w:sz w:val="18"/>
                 <w:szCs w:val="18"/>
               </w:rPr>
               <w:t xml:space="preserve"> </w:t>
-            </w:r>
-            <w:proofErr w:type="gramStart"/>
-            <w:r>
-              <w:rPr>
-                <w:rFonts w:ascii="Calibri" w:eastAsia="Calibri" w:hAnsi="Calibri" w:cs="Calibri"/>
-                <w:b/>
-                <w:bCs/>
-                <w:sz w:val="18"/>
-                <w:szCs w:val="18"/>
-              </w:rPr>
-              <w:t>4444 (.</w:t>
-            </w:r>
-            <w:proofErr w:type="gramEnd"/>
-            <w:r>
-              <w:rPr>
-                <w:rFonts w:ascii="Calibri" w:eastAsia="Calibri" w:hAnsi="Calibri" w:cs="Calibri"/>
-                <w:b/>
-                <w:bCs/>
-                <w:sz w:val="18"/>
-                <w:szCs w:val="18"/>
-              </w:rPr>
-              <w:t xml:space="preserve">mov) only when alpha channel is required </w:t>
             </w:r>
             <w:r>
               <w:rPr>
@@ -1413,7 +1411,7 @@
                 <w:sz w:val="18"/>
                 <w:szCs w:val="18"/>
               </w:rPr>
-              <w:t>(F</w:t>
+              <w:t>(</w:t>
             </w:r>
             <w:r>
               <w:rPr>
@@ -1424,9 +1422,8 @@
                 <w:sz w:val="18"/>
                 <w:szCs w:val="18"/>
               </w:rPr>
-              <w:t xml:space="preserve">iles will be transcoded to </w:t>
-            </w:r>
-            <w:proofErr w:type="spellStart"/>
+              <w:t>Additional Info goes here if needed</w:t>
+            </w:r>
             <w:r>
               <w:rPr>
                 <w:rFonts w:ascii="Calibri" w:eastAsia="Calibri" w:hAnsi="Calibri" w:cs="Calibri"/>
@@ -1436,64 +1433,6 @@
                 <w:sz w:val="18"/>
                 <w:szCs w:val="18"/>
               </w:rPr>
-              <w:t>NotchLC</w:t>
-            </w:r>
-            <w:proofErr w:type="spellEnd"/>
-            <w:r>
-              <w:rPr>
-                <w:rFonts w:ascii="Calibri" w:eastAsia="Calibri" w:hAnsi="Calibri" w:cs="Calibri"/>
-                <w:i/>
-                <w:iCs/>
-                <w:color w:val="606060"/>
-                <w:sz w:val="18"/>
-                <w:szCs w:val="18"/>
-              </w:rPr>
-              <w:t xml:space="preserve"> at intake </w:t>
-            </w:r>
-            <w:r>
-              <w:rPr>
-                <w:rFonts w:ascii="Calibri" w:eastAsia="Calibri" w:hAnsi="Calibri" w:cs="Calibri"/>
-                <w:i/>
-                <w:iCs/>
-                <w:color w:val="606060"/>
-                <w:sz w:val="18"/>
-                <w:szCs w:val="18"/>
-              </w:rPr>
-              <w:t>-</w:t>
-            </w:r>
-            <w:r>
-              <w:rPr>
-                <w:rFonts w:ascii="Calibri" w:eastAsia="Calibri" w:hAnsi="Calibri" w:cs="Calibri"/>
-                <w:i/>
-                <w:iCs/>
-                <w:color w:val="606060"/>
-                <w:sz w:val="18"/>
-                <w:szCs w:val="18"/>
-              </w:rPr>
-              <w:t xml:space="preserve"> do not deliver in </w:t>
-            </w:r>
-            <w:proofErr w:type="spellStart"/>
-            <w:r>
-              <w:rPr>
-                <w:rFonts w:ascii="Calibri" w:eastAsia="Calibri" w:hAnsi="Calibri" w:cs="Calibri"/>
-                <w:i/>
-                <w:iCs/>
-                <w:color w:val="606060"/>
-                <w:sz w:val="18"/>
-                <w:szCs w:val="18"/>
-              </w:rPr>
-              <w:t>NotchLC</w:t>
-            </w:r>
-            <w:proofErr w:type="spellEnd"/>
-            <w:r>
-              <w:rPr>
-                <w:rFonts w:ascii="Calibri" w:eastAsia="Calibri" w:hAnsi="Calibri" w:cs="Calibri"/>
-                <w:i/>
-                <w:iCs/>
-                <w:color w:val="606060"/>
-                <w:sz w:val="18"/>
-                <w:szCs w:val="18"/>
-              </w:rPr>
               <w:t>)</w:t>
             </w:r>
           </w:p>
@@ -1555,7 +1494,29 @@
                 <w:sz w:val="18"/>
                 <w:szCs w:val="18"/>
               </w:rPr>
-              <w:t>[Rec.709]</w:t>
+              <w:t>[</w:t>
+            </w:r>
+            <w:r>
+              <w:rPr>
+                <w:rFonts w:ascii="Calibri" w:eastAsia="Calibri" w:hAnsi="Calibri" w:cs="Calibri"/>
+                <w:b/>
+                <w:bCs/>
+                <w:color w:val="C0392B"/>
+                <w:sz w:val="18"/>
+                <w:szCs w:val="18"/>
+              </w:rPr>
+              <w:t>Color Space</w:t>
+            </w:r>
+            <w:r>
+              <w:rPr>
+                <w:rFonts w:ascii="Calibri" w:eastAsia="Calibri" w:hAnsi="Calibri" w:cs="Calibri"/>
+                <w:b/>
+                <w:bCs/>
+                <w:color w:val="C0392B"/>
+                <w:sz w:val="18"/>
+                <w:szCs w:val="18"/>
+              </w:rPr>
+              <w:t>]</w:t>
             </w:r>
             <w:r>
               <w:rPr>
@@ -3030,6 +2991,12 @@
     <w:p>
       <w:pPr>
         <w:spacing w:after="60"/>
+        <w:rPr>
+          <w:rFonts w:ascii="Calibri" w:eastAsia="Calibri" w:hAnsi="Calibri" w:cs="Calibri"/>
+          <w:color w:val="000000"/>
+          <w:sz w:val="18"/>
+          <w:szCs w:val="18"/>
+        </w:rPr>
       </w:pPr>
       <w:r>
         <w:rPr>
@@ -3038,18 +3005,7 @@
           <w:sz w:val="18"/>
           <w:szCs w:val="18"/>
         </w:rPr>
-        <w:t xml:space="preserve">Before committing to full content production, please render and deliver a 5-second test clip at the full specs above </w:t>
-      </w:r>
-      <w:r>
-        <w:rPr>
-          <w:rFonts w:ascii="Calibri" w:eastAsia="Calibri" w:hAnsi="Calibri" w:cs="Calibri"/>
-          <w:i/>
-          <w:iCs/>
-          <w:color w:val="606060"/>
-          <w:sz w:val="18"/>
-          <w:szCs w:val="18"/>
-        </w:rPr>
-        <w:t>(resolution, framerate, codec, color space)</w:t>
+        <w:t>Before committing to full content production</w:t>
       </w:r>
       <w:r>
         <w:rPr>
@@ -3058,7 +3014,7 @@
           <w:sz w:val="18"/>
           <w:szCs w:val="18"/>
         </w:rPr>
-        <w:t xml:space="preserve"> </w:t>
+        <w:t xml:space="preserve"> -</w:t>
       </w:r>
       <w:r>
         <w:rPr>
@@ -3067,7 +3023,7 @@
           <w:sz w:val="18"/>
           <w:szCs w:val="18"/>
         </w:rPr>
-        <w:t>for at least one screen. We</w:t>
+        <w:t xml:space="preserve"> deliver a 5-second test clip at the full specs above</w:t>
       </w:r>
       <w:r>
         <w:rPr>
@@ -3076,44 +3032,13 @@
           <w:sz w:val="18"/>
           <w:szCs w:val="18"/>
         </w:rPr>
-        <w:t xml:space="preserve"> will</w:t>
-      </w:r>
-      <w:r>
-        <w:rPr>
-          <w:rFonts w:ascii="Calibri" w:eastAsia="Calibri" w:hAnsi="Calibri" w:cs="Calibri"/>
-          <w:color w:val="000000"/>
-          <w:sz w:val="18"/>
-          <w:szCs w:val="18"/>
-        </w:rPr>
-        <w:t xml:space="preserve"> verify it plays correctly before build</w:t>
-      </w:r>
-      <w:r>
-        <w:rPr>
-          <w:rFonts w:ascii="Calibri" w:eastAsia="Calibri" w:hAnsi="Calibri" w:cs="Calibri"/>
-          <w:color w:val="000000"/>
-          <w:sz w:val="18"/>
-          <w:szCs w:val="18"/>
-        </w:rPr>
-        <w:t>ing</w:t>
-      </w:r>
-      <w:r>
-        <w:rPr>
-          <w:rFonts w:ascii="Calibri" w:eastAsia="Calibri" w:hAnsi="Calibri" w:cs="Calibri"/>
-          <w:color w:val="000000"/>
-          <w:sz w:val="18"/>
-          <w:szCs w:val="18"/>
-        </w:rPr>
-        <w:t xml:space="preserve"> the full show </w:t>
-      </w:r>
-      <w:r>
-        <w:rPr>
-          <w:rFonts w:ascii="Calibri" w:eastAsia="Calibri" w:hAnsi="Calibri" w:cs="Calibri"/>
-          <w:color w:val="000000"/>
-          <w:sz w:val="18"/>
-          <w:szCs w:val="18"/>
-        </w:rPr>
-        <w:t>to catch potential issues early</w:t>
-      </w:r>
+        <w:t xml:space="preserve"> to verify playback on our end</w:t>
+      </w:r>
+    </w:p>
+    <w:p>
+      <w:pPr>
+        <w:spacing w:after="60"/>
+      </w:pPr>
     </w:p>
     <w:p>
       <w:pPr>

</xml_diff>